<commit_message>
Aclara cómo ejecutar k6, npm audit, Trivy y ZAP sin apagar Atlas antes.
</commit_message>
<xml_diff>
--- a/entrega/Paso_a_Paso_Atlas.docx
+++ b/entrega/Paso_a_Paso_Atlas.docx
@@ -2422,6 +2422,20 @@
     </w:p>
     <w:p>
       <w:pPr>
+        <w:spacing w:line="360" w:lineRule="auto" w:before="0" w:after="120"/>
+        <w:jc w:val="both"/>
+      </w:pPr>
+      <w:r>
+        <w:rPr>
+          <w:rFonts w:ascii="Arial" w:hAnsi="Arial" w:eastAsia="Arial"/>
+          <w:b w:val="0"/>
+          <w:sz w:val="22"/>
+        </w:rPr>
+        <w:t>Este paso va al final, cuando ya terminaron las pruebas 11 a 14. Si se apaga ahora, k6, npm audit y ZAP no tienen a dónde conectarse.</w:t>
+      </w:r>
+    </w:p>
+    <w:p>
+      <w:pPr>
         <w:spacing w:line="360" w:lineRule="auto" w:before="40" w:after="120"/>
         <w:jc w:val="left"/>
       </w:pPr>
@@ -2869,7 +2883,7 @@
           <w:color w:val="182B46"/>
           <w:sz w:val="24"/>
         </w:rPr>
-        <w:t>11. Carga con k6 (CP-PERF-01)</w:t>
+        <w:t>Antes de los pasos 11 a 14</w:t>
       </w:r>
     </w:p>
     <w:p>
@@ -2883,7 +2897,7 @@
           <w:b w:val="0"/>
           <w:sz w:val="22"/>
         </w:rPr>
-        <w:t xml:space="preserve">Hace falta que la API ya esté en http://localhost:3010. Desde </w:t>
+        <w:t xml:space="preserve">Los pasos 11 a 14 se corren con Atlas encendido. No hace falta instalar k6, npm, Trivy ni ZAP en Windows: cada uno entra por una imagen de Docker. La primera vez esa imagen se descarga y el comando puede tardar varios minutos. Una línea que diga </w:t>
       </w:r>
       <w:r>
         <w:rPr>
@@ -2891,7 +2905,37 @@
           <w:b w:val="0"/>
           <w:sz w:val="22"/>
         </w:rPr>
-        <w:t>codigo\atlas</w:t>
+        <w:t>Unable to find image</w:t>
+      </w:r>
+      <w:r>
+        <w:rPr>
+          <w:rFonts w:ascii="Arial" w:hAnsi="Arial" w:eastAsia="Arial"/>
+          <w:b w:val="0"/>
+          <w:sz w:val="22"/>
+        </w:rPr>
+        <w:t xml:space="preserve"> significa que la está bajando, no que la prueba falló.</w:t>
+      </w:r>
+    </w:p>
+    <w:p>
+      <w:pPr>
+        <w:spacing w:line="360" w:lineRule="auto" w:before="0" w:after="120"/>
+        <w:jc w:val="both"/>
+      </w:pPr>
+      <w:r>
+        <w:rPr>
+          <w:rFonts w:ascii="Arial" w:hAnsi="Arial" w:eastAsia="Arial"/>
+          <w:b w:val="0"/>
+          <w:sz w:val="22"/>
+        </w:rPr>
+        <w:t xml:space="preserve">Abrir PowerShell y entrar otra vez a la carpeta del paso 2. El prompt tiene que terminar en </w:t>
+      </w:r>
+      <w:r>
+        <w:rPr>
+          <w:rFonts w:ascii="Consolas" w:hAnsi="Consolas" w:eastAsia="Consolas"/>
+          <w:b w:val="0"/>
+          <w:sz w:val="22"/>
+        </w:rPr>
+        <w:t>\atlas</w:t>
       </w:r>
       <w:r>
         <w:rPr>
@@ -2913,7 +2957,9 @@
           <w:b w:val="0"/>
           <w:sz w:val="18"/>
         </w:rPr>
-        <w:t>docker run --rm -v "${PWD}\pruebas:/scripts" grafana/k6 run /scripts/carga.js</w:t>
+        <w:t>cd seguridad-calidad-software-ev2-atlas\codigo\atlas</w:t>
+        <w:br/>
+        <w:t>docker compose ps</w:t>
       </w:r>
     </w:p>
     <w:p>
@@ -2927,7 +2973,7 @@
           <w:b w:val="0"/>
           <w:sz w:val="22"/>
         </w:rPr>
-        <w:t xml:space="preserve">El script </w:t>
+        <w:t xml:space="preserve">Tienen que aparecer </w:t>
       </w:r>
       <w:r>
         <w:rPr>
@@ -2935,7 +2981,7 @@
           <w:b w:val="0"/>
           <w:sz w:val="22"/>
         </w:rPr>
-        <w:t>pruebas\carga.js</w:t>
+        <w:t>api</w:t>
       </w:r>
       <w:r>
         <w:rPr>
@@ -2943,7 +2989,158 @@
           <w:b w:val="0"/>
           <w:sz w:val="22"/>
         </w:rPr>
-        <w:t xml:space="preserve"> entra como </w:t>
+        <w:t xml:space="preserve"> y </w:t>
+      </w:r>
+      <w:r>
+        <w:rPr>
+          <w:rFonts w:ascii="Consolas" w:hAnsi="Consolas" w:eastAsia="Consolas"/>
+          <w:b w:val="0"/>
+          <w:sz w:val="22"/>
+        </w:rPr>
+        <w:t>web</w:t>
+      </w:r>
+      <w:r>
+        <w:rPr>
+          <w:rFonts w:ascii="Arial" w:hAnsi="Arial" w:eastAsia="Arial"/>
+          <w:b w:val="0"/>
+          <w:sz w:val="22"/>
+        </w:rPr>
+        <w:t xml:space="preserve"> en ejecución, y </w:t>
+      </w:r>
+      <w:r>
+        <w:rPr>
+          <w:rFonts w:ascii="Consolas" w:hAnsi="Consolas" w:eastAsia="Consolas"/>
+          <w:b w:val="0"/>
+          <w:sz w:val="22"/>
+        </w:rPr>
+        <w:t>db</w:t>
+      </w:r>
+      <w:r>
+        <w:rPr>
+          <w:rFonts w:ascii="Arial" w:hAnsi="Arial" w:eastAsia="Arial"/>
+          <w:b w:val="0"/>
+          <w:sz w:val="22"/>
+        </w:rPr>
+        <w:t xml:space="preserve"> healthy. Si no están, volver a levantarlos y esperar a que la salud responda:</w:t>
+      </w:r>
+    </w:p>
+    <w:p>
+      <w:pPr>
+        <w:spacing w:line="360" w:lineRule="auto" w:before="40" w:after="120"/>
+        <w:jc w:val="left"/>
+      </w:pPr>
+      <w:r>
+        <w:rPr>
+          <w:rFonts w:ascii="Arial" w:hAnsi="Arial" w:eastAsia="Arial"/>
+          <w:b w:val="0"/>
+          <w:sz w:val="18"/>
+        </w:rPr>
+        <w:t>docker compose up -d</w:t>
+      </w:r>
+    </w:p>
+    <w:p>
+      <w:pPr>
+        <w:spacing w:line="360" w:lineRule="auto" w:before="0" w:after="120"/>
+        <w:jc w:val="both"/>
+      </w:pPr>
+      <w:r>
+        <w:rPr>
+          <w:rFonts w:ascii="Arial" w:hAnsi="Arial" w:eastAsia="Arial"/>
+          <w:b w:val="0"/>
+          <w:sz w:val="22"/>
+        </w:rPr>
+        <w:t xml:space="preserve">En el navegador, http://localhost:3010/api/salud debe mostrar </w:t>
+      </w:r>
+      <w:r>
+        <w:rPr>
+          <w:rFonts w:ascii="Consolas" w:hAnsi="Consolas" w:eastAsia="Consolas"/>
+          <w:b w:val="0"/>
+          <w:sz w:val="22"/>
+        </w:rPr>
+        <w:t>{"servicio":"atlas","estado":"ok"}</w:t>
+      </w:r>
+      <w:r>
+        <w:rPr>
+          <w:rFonts w:ascii="Arial" w:hAnsi="Arial" w:eastAsia="Arial"/>
+          <w:b w:val="0"/>
+          <w:sz w:val="22"/>
+        </w:rPr>
+        <w:t xml:space="preserve"> y http://localhost:8080 debe abrir la pantalla. Sin esas dos páginas, los pasos 11 y 14 no tienen destino.</w:t>
+      </w:r>
+    </w:p>
+    <w:p>
+      <w:pPr>
+        <w:spacing w:line="360" w:lineRule="auto" w:before="0" w:after="120"/>
+        <w:jc w:val="both"/>
+      </w:pPr>
+      <w:r>
+        <w:rPr>
+          <w:rFonts w:ascii="Arial" w:hAnsi="Arial" w:eastAsia="Arial"/>
+          <w:b w:val="0"/>
+          <w:sz w:val="22"/>
+        </w:rPr>
+        <w:t>La salida de cada comando se ve en la consola y además queda guardada. En PowerShell, las líneas en rojo suelen ser el canal de aviso de Docker. El resultado se lee al final del texto, no por el color.</w:t>
+      </w:r>
+    </w:p>
+    <w:p>
+      <w:pPr>
+        <w:spacing w:line="360" w:lineRule="auto" w:before="240" w:after="80"/>
+        <w:jc w:val="left"/>
+      </w:pPr>
+      <w:r>
+        <w:rPr>
+          <w:rFonts w:ascii="Arial" w:hAnsi="Arial" w:eastAsia="Arial"/>
+          <w:b/>
+          <w:color w:val="182B46"/>
+          <w:sz w:val="24"/>
+        </w:rPr>
+        <w:t>11. Carga con k6 (CP-PERF-01)</w:t>
+      </w:r>
+    </w:p>
+    <w:p>
+      <w:pPr>
+        <w:spacing w:line="360" w:lineRule="auto" w:before="0" w:after="120"/>
+        <w:jc w:val="both"/>
+      </w:pPr>
+      <w:r>
+        <w:rPr>
+          <w:rFonts w:ascii="Arial" w:hAnsi="Arial" w:eastAsia="Arial"/>
+          <w:b w:val="0"/>
+          <w:sz w:val="22"/>
+        </w:rPr>
+        <w:t xml:space="preserve">Seguir en </w:t>
+      </w:r>
+      <w:r>
+        <w:rPr>
+          <w:rFonts w:ascii="Consolas" w:hAnsi="Consolas" w:eastAsia="Consolas"/>
+          <w:b w:val="0"/>
+          <w:sz w:val="22"/>
+        </w:rPr>
+        <w:t>codigo\atlas</w:t>
+      </w:r>
+      <w:r>
+        <w:rPr>
+          <w:rFonts w:ascii="Arial" w:hAnsi="Arial" w:eastAsia="Arial"/>
+          <w:b w:val="0"/>
+          <w:sz w:val="22"/>
+        </w:rPr>
+        <w:t xml:space="preserve">. Este comando monta la carpeta </w:t>
+      </w:r>
+      <w:r>
+        <w:rPr>
+          <w:rFonts w:ascii="Consolas" w:hAnsi="Consolas" w:eastAsia="Consolas"/>
+          <w:b w:val="0"/>
+          <w:sz w:val="22"/>
+        </w:rPr>
+        <w:t>pruebas</w:t>
+      </w:r>
+      <w:r>
+        <w:rPr>
+          <w:rFonts w:ascii="Arial" w:hAnsi="Arial" w:eastAsia="Arial"/>
+          <w:b w:val="0"/>
+          <w:sz w:val="22"/>
+        </w:rPr>
+        <w:t xml:space="preserve">, entra como </w:t>
       </w:r>
       <w:r>
         <w:rPr>
@@ -2959,7 +3156,25 @@
           <w:b w:val="0"/>
           <w:sz w:val="22"/>
         </w:rPr>
-        <w:t xml:space="preserve"> y, con 200 usuarios durante 20 segundos, consulta el listado de clientes de la empresa 1. Los umbrales pedidos son menos de 1 % de error y p95 menor a 300 ms.</w:t>
+        <w:t xml:space="preserve"> y durante 20 segundos lanza 200 usuarios contra el listado de clientes:</w:t>
+      </w:r>
+    </w:p>
+    <w:p>
+      <w:pPr>
+        <w:spacing w:line="360" w:lineRule="auto" w:before="40" w:after="120"/>
+        <w:jc w:val="left"/>
+      </w:pPr>
+      <w:r>
+        <w:rPr>
+          <w:rFonts w:ascii="Arial" w:hAnsi="Arial" w:eastAsia="Arial"/>
+          <w:b w:val="0"/>
+          <w:sz w:val="18"/>
+        </w:rPr>
+        <w:t>New-Item -ItemType Directory -Force -Path ..\..\evidencias\atlas\otras | Out-Null</w:t>
+        <w:br/>
+        <w:t>docker run --rm -v "${PWD}\pruebas:/scripts" grafana/k6 run /scripts/carga.js 2&gt;&amp;1 | Tee-Object -FilePath ..\..\evidencias\atlas\otras\k6-carga.txt</w:t>
+        <w:br/>
+        <w:t>Write-Output "CODIGO $LASTEXITCODE"</w:t>
       </w:r>
     </w:p>
     <w:p>
@@ -2973,49 +3188,7 @@
           <w:b w:val="0"/>
           <w:sz w:val="22"/>
         </w:rPr>
-        <w:t>En la corrida del 17 de octubre de 2026 el resultado fue:</w:t>
-      </w:r>
-    </w:p>
-    <w:p>
-      <w:pPr>
-        <w:spacing w:line="360" w:lineRule="auto" w:before="0" w:after="40"/>
-        <w:jc w:val="left"/>
-      </w:pPr>
-      <w:r>
-        <w:rPr>
-          <w:rFonts w:ascii="Arial" w:hAnsi="Arial" w:eastAsia="Arial"/>
-          <w:b w:val="0"/>
-          <w:sz w:val="22"/>
-        </w:rPr>
-        <w:t>4428 peticiones</w:t>
-      </w:r>
-    </w:p>
-    <w:p>
-      <w:pPr>
-        <w:spacing w:line="360" w:lineRule="auto" w:before="0" w:after="40"/>
-        <w:jc w:val="left"/>
-      </w:pPr>
-      <w:r>
-        <w:rPr>
-          <w:rFonts w:ascii="Arial" w:hAnsi="Arial" w:eastAsia="Arial"/>
-          <w:b w:val="0"/>
-          <w:sz w:val="22"/>
-        </w:rPr>
-        <w:t>0 % de error</w:t>
-      </w:r>
-    </w:p>
-    <w:p>
-      <w:pPr>
-        <w:spacing w:line="360" w:lineRule="auto" w:before="0" w:after="40"/>
-        <w:jc w:val="left"/>
-      </w:pPr>
-      <w:r>
-        <w:rPr>
-          <w:rFonts w:ascii="Arial" w:hAnsi="Arial" w:eastAsia="Arial"/>
-          <w:b w:val="0"/>
-          <w:sz w:val="22"/>
-        </w:rPr>
-        <w:t>p95 = 1,28 s</w:t>
+        <w:t>Qué esperar:</w:t>
       </w:r>
     </w:p>
     <w:p>
@@ -3029,7 +3202,159 @@
           <w:b w:val="0"/>
           <w:sz w:val="22"/>
         </w:rPr>
-        <w:t xml:space="preserve">k6 termina con código 99 cuando un umbral no se cumple. En este caso falló el tiempo, no la herramienta. Guardar la salida en </w:t>
+        <w:t xml:space="preserve">1. La primera vez, la descarga de </w:t>
+      </w:r>
+      <w:r>
+        <w:rPr>
+          <w:rFonts w:ascii="Consolas" w:hAnsi="Consolas" w:eastAsia="Consolas"/>
+          <w:b w:val="0"/>
+          <w:sz w:val="22"/>
+        </w:rPr>
+        <w:t>grafana/k6</w:t>
+      </w:r>
+      <w:r>
+        <w:rPr>
+          <w:rFonts w:ascii="Arial" w:hAnsi="Arial" w:eastAsia="Arial"/>
+          <w:b w:val="0"/>
+          <w:sz w:val="22"/>
+        </w:rPr>
+        <w:t>.</w:t>
+      </w:r>
+    </w:p>
+    <w:p>
+      <w:pPr>
+        <w:spacing w:line="360" w:lineRule="auto" w:before="0" w:after="120"/>
+        <w:jc w:val="both"/>
+      </w:pPr>
+      <w:r>
+        <w:rPr>
+          <w:rFonts w:ascii="Arial" w:hAnsi="Arial" w:eastAsia="Arial"/>
+          <w:b w:val="0"/>
+          <w:sz w:val="22"/>
+        </w:rPr>
+        <w:t xml:space="preserve">2. Unas líneas </w:t>
+      </w:r>
+      <w:r>
+        <w:rPr>
+          <w:rFonts w:ascii="Consolas" w:hAnsi="Consolas" w:eastAsia="Consolas"/>
+          <w:b w:val="0"/>
+          <w:sz w:val="22"/>
+        </w:rPr>
+        <w:t>running</w:t>
+      </w:r>
+      <w:r>
+        <w:rPr>
+          <w:rFonts w:ascii="Arial" w:hAnsi="Arial" w:eastAsia="Arial"/>
+          <w:b w:val="0"/>
+          <w:sz w:val="22"/>
+        </w:rPr>
+        <w:t xml:space="preserve"> con </w:t>
+      </w:r>
+      <w:r>
+        <w:rPr>
+          <w:rFonts w:ascii="Consolas" w:hAnsi="Consolas" w:eastAsia="Consolas"/>
+          <w:b w:val="0"/>
+          <w:sz w:val="22"/>
+        </w:rPr>
+        <w:t>200/200 VUs</w:t>
+      </w:r>
+      <w:r>
+        <w:rPr>
+          <w:rFonts w:ascii="Arial" w:hAnsi="Arial" w:eastAsia="Arial"/>
+          <w:b w:val="0"/>
+          <w:sz w:val="22"/>
+        </w:rPr>
+        <w:t xml:space="preserve"> durante unos 20 segundos.</w:t>
+      </w:r>
+    </w:p>
+    <w:p>
+      <w:pPr>
+        <w:spacing w:line="360" w:lineRule="auto" w:before="0" w:after="120"/>
+        <w:jc w:val="both"/>
+      </w:pPr>
+      <w:r>
+        <w:rPr>
+          <w:rFonts w:ascii="Arial" w:hAnsi="Arial" w:eastAsia="Arial"/>
+          <w:b w:val="0"/>
+          <w:sz w:val="22"/>
+        </w:rPr>
+        <w:t xml:space="preserve">3. Al cierre, </w:t>
+      </w:r>
+      <w:r>
+        <w:rPr>
+          <w:rFonts w:ascii="Consolas" w:hAnsi="Consolas" w:eastAsia="Consolas"/>
+          <w:b w:val="0"/>
+          <w:sz w:val="22"/>
+        </w:rPr>
+        <w:t>checks_succeeded</w:t>
+      </w:r>
+      <w:r>
+        <w:rPr>
+          <w:rFonts w:ascii="Arial" w:hAnsi="Arial" w:eastAsia="Arial"/>
+          <w:b w:val="0"/>
+          <w:sz w:val="22"/>
+        </w:rPr>
+        <w:t xml:space="preserve"> en 100 % y </w:t>
+      </w:r>
+      <w:r>
+        <w:rPr>
+          <w:rFonts w:ascii="Consolas" w:hAnsi="Consolas" w:eastAsia="Consolas"/>
+          <w:b w:val="0"/>
+          <w:sz w:val="22"/>
+        </w:rPr>
+        <w:t>http_req_failed</w:t>
+      </w:r>
+      <w:r>
+        <w:rPr>
+          <w:rFonts w:ascii="Arial" w:hAnsi="Arial" w:eastAsia="Arial"/>
+          <w:b w:val="0"/>
+          <w:sz w:val="22"/>
+        </w:rPr>
+        <w:t xml:space="preserve"> en 0 %.</w:t>
+      </w:r>
+    </w:p>
+    <w:p>
+      <w:pPr>
+        <w:spacing w:line="360" w:lineRule="auto" w:before="0" w:after="120"/>
+        <w:jc w:val="both"/>
+      </w:pPr>
+      <w:r>
+        <w:rPr>
+          <w:rFonts w:ascii="Arial" w:hAnsi="Arial" w:eastAsia="Arial"/>
+          <w:b w:val="0"/>
+          <w:sz w:val="22"/>
+        </w:rPr>
+        <w:t xml:space="preserve">4. </w:t>
+      </w:r>
+      <w:r>
+        <w:rPr>
+          <w:rFonts w:ascii="Consolas" w:hAnsi="Consolas" w:eastAsia="Consolas"/>
+          <w:b w:val="0"/>
+          <w:sz w:val="22"/>
+        </w:rPr>
+        <w:t>CODIGO 99</w:t>
+      </w:r>
+      <w:r>
+        <w:rPr>
+          <w:rFonts w:ascii="Arial" w:hAnsi="Arial" w:eastAsia="Arial"/>
+          <w:b w:val="0"/>
+          <w:sz w:val="22"/>
+        </w:rPr>
+        <w:t>. Ese 99 es el resultado esperado: k6 avisa que el p95 superó los 300 ms. La herramienta sí terminó.</w:t>
+      </w:r>
+    </w:p>
+    <w:p>
+      <w:pPr>
+        <w:spacing w:line="360" w:lineRule="auto" w:before="0" w:after="120"/>
+        <w:jc w:val="both"/>
+      </w:pPr>
+      <w:r>
+        <w:rPr>
+          <w:rFonts w:ascii="Arial" w:hAnsi="Arial" w:eastAsia="Arial"/>
+          <w:b w:val="0"/>
+          <w:sz w:val="22"/>
+        </w:rPr>
+        <w:t xml:space="preserve">En la corrida del 17 de octubre de 2026 hubo 4428 peticiones, 0 % de error y p95 de 1,28 s. Una corrida nueva puede variar el tiempo. El archivo queda en </w:t>
       </w:r>
       <w:r>
         <w:rPr>
@@ -3074,7 +3399,7 @@
           <w:b w:val="0"/>
           <w:sz w:val="22"/>
         </w:rPr>
-        <w:t xml:space="preserve">Con el contenedor </w:t>
+        <w:t xml:space="preserve">Seguir en </w:t>
       </w:r>
       <w:r>
         <w:rPr>
@@ -3082,7 +3407,7 @@
           <w:b w:val="0"/>
           <w:sz w:val="22"/>
         </w:rPr>
-        <w:t>atlas-api-1</w:t>
+        <w:t>codigo\atlas</w:t>
       </w:r>
       <w:r>
         <w:rPr>
@@ -3090,7 +3415,23 @@
           <w:b w:val="0"/>
           <w:sz w:val="22"/>
         </w:rPr>
-        <w:t xml:space="preserve"> en marcha:</w:t>
+        <w:t xml:space="preserve">. El comando entra al servicio </w:t>
+      </w:r>
+      <w:r>
+        <w:rPr>
+          <w:rFonts w:ascii="Consolas" w:hAnsi="Consolas" w:eastAsia="Consolas"/>
+          <w:b w:val="0"/>
+          <w:sz w:val="22"/>
+        </w:rPr>
+        <w:t>api</w:t>
+      </w:r>
+      <w:r>
+        <w:rPr>
+          <w:rFonts w:ascii="Arial" w:hAnsi="Arial" w:eastAsia="Arial"/>
+          <w:b w:val="0"/>
+          <w:sz w:val="22"/>
+        </w:rPr>
+        <w:t xml:space="preserve"> que ya está corriendo. No hace falta buscar el nombre del contenedor:</w:t>
       </w:r>
     </w:p>
     <w:p>
@@ -3104,7 +3445,9 @@
           <w:b w:val="0"/>
           <w:sz w:val="18"/>
         </w:rPr>
-        <w:t>docker exec atlas-api-1 npm audit --audit-level=low</w:t>
+        <w:t>docker compose exec api npm audit --audit-level=low 2&gt;&amp;1 | Tee-Object -FilePath ..\..\evidencias\atlas\otras\npm-audit-api.txt</w:t>
+        <w:br/>
+        <w:t>Write-Output "CODIGO $LASTEXITCODE"</w:t>
       </w:r>
     </w:p>
     <w:p>
@@ -3118,7 +3461,191 @@
           <w:b w:val="0"/>
           <w:sz w:val="22"/>
         </w:rPr>
-        <w:t xml:space="preserve">El comando sale con código 1 si encuentra vulnerabilidades. En la corrida del 17-10-2026 hubo 7: 3 altas, 1 moderada y 3 bajas, en Express 4.19.2 y en body-parser, cookie, path-to-regexp, qs y send. El arreglo que propone npm instala Express 4.22.3, fuera de la versión fijada. El log está en </w:t>
+        <w:t>Qué esperar:</w:t>
+      </w:r>
+    </w:p>
+    <w:p>
+      <w:pPr>
+        <w:spacing w:line="360" w:lineRule="auto" w:before="0" w:after="120"/>
+        <w:jc w:val="both"/>
+      </w:pPr>
+      <w:r>
+        <w:rPr>
+          <w:rFonts w:ascii="Arial" w:hAnsi="Arial" w:eastAsia="Arial"/>
+          <w:b w:val="0"/>
+          <w:sz w:val="22"/>
+        </w:rPr>
+        <w:t xml:space="preserve">1. Un informe con paquetes como </w:t>
+      </w:r>
+      <w:r>
+        <w:rPr>
+          <w:rFonts w:ascii="Consolas" w:hAnsi="Consolas" w:eastAsia="Consolas"/>
+          <w:b w:val="0"/>
+          <w:sz w:val="22"/>
+        </w:rPr>
+        <w:t>express</w:t>
+      </w:r>
+      <w:r>
+        <w:rPr>
+          <w:rFonts w:ascii="Arial" w:hAnsi="Arial" w:eastAsia="Arial"/>
+          <w:b w:val="0"/>
+          <w:sz w:val="22"/>
+        </w:rPr>
+        <w:t xml:space="preserve">, </w:t>
+      </w:r>
+      <w:r>
+        <w:rPr>
+          <w:rFonts w:ascii="Consolas" w:hAnsi="Consolas" w:eastAsia="Consolas"/>
+          <w:b w:val="0"/>
+          <w:sz w:val="22"/>
+        </w:rPr>
+        <w:t>body-parser</w:t>
+      </w:r>
+      <w:r>
+        <w:rPr>
+          <w:rFonts w:ascii="Arial" w:hAnsi="Arial" w:eastAsia="Arial"/>
+          <w:b w:val="0"/>
+          <w:sz w:val="22"/>
+        </w:rPr>
+        <w:t xml:space="preserve">, </w:t>
+      </w:r>
+      <w:r>
+        <w:rPr>
+          <w:rFonts w:ascii="Consolas" w:hAnsi="Consolas" w:eastAsia="Consolas"/>
+          <w:b w:val="0"/>
+          <w:sz w:val="22"/>
+        </w:rPr>
+        <w:t>cookie</w:t>
+      </w:r>
+      <w:r>
+        <w:rPr>
+          <w:rFonts w:ascii="Arial" w:hAnsi="Arial" w:eastAsia="Arial"/>
+          <w:b w:val="0"/>
+          <w:sz w:val="22"/>
+        </w:rPr>
+        <w:t xml:space="preserve">, </w:t>
+      </w:r>
+      <w:r>
+        <w:rPr>
+          <w:rFonts w:ascii="Consolas" w:hAnsi="Consolas" w:eastAsia="Consolas"/>
+          <w:b w:val="0"/>
+          <w:sz w:val="22"/>
+        </w:rPr>
+        <w:t>path-to-regexp</w:t>
+      </w:r>
+      <w:r>
+        <w:rPr>
+          <w:rFonts w:ascii="Arial" w:hAnsi="Arial" w:eastAsia="Arial"/>
+          <w:b w:val="0"/>
+          <w:sz w:val="22"/>
+        </w:rPr>
+        <w:t xml:space="preserve">, </w:t>
+      </w:r>
+      <w:r>
+        <w:rPr>
+          <w:rFonts w:ascii="Consolas" w:hAnsi="Consolas" w:eastAsia="Consolas"/>
+          <w:b w:val="0"/>
+          <w:sz w:val="22"/>
+        </w:rPr>
+        <w:t>qs</w:t>
+      </w:r>
+      <w:r>
+        <w:rPr>
+          <w:rFonts w:ascii="Arial" w:hAnsi="Arial" w:eastAsia="Arial"/>
+          <w:b w:val="0"/>
+          <w:sz w:val="22"/>
+        </w:rPr>
+        <w:t xml:space="preserve"> y </w:t>
+      </w:r>
+      <w:r>
+        <w:rPr>
+          <w:rFonts w:ascii="Consolas" w:hAnsi="Consolas" w:eastAsia="Consolas"/>
+          <w:b w:val="0"/>
+          <w:sz w:val="22"/>
+        </w:rPr>
+        <w:t>send</w:t>
+      </w:r>
+      <w:r>
+        <w:rPr>
+          <w:rFonts w:ascii="Arial" w:hAnsi="Arial" w:eastAsia="Arial"/>
+          <w:b w:val="0"/>
+          <w:sz w:val="22"/>
+        </w:rPr>
+        <w:t>.</w:t>
+      </w:r>
+    </w:p>
+    <w:p>
+      <w:pPr>
+        <w:spacing w:line="360" w:lineRule="auto" w:before="0" w:after="120"/>
+        <w:jc w:val="both"/>
+      </w:pPr>
+      <w:r>
+        <w:rPr>
+          <w:rFonts w:ascii="Arial" w:hAnsi="Arial" w:eastAsia="Arial"/>
+          <w:b w:val="0"/>
+          <w:sz w:val="22"/>
+        </w:rPr>
+        <w:t xml:space="preserve">2. Una línea final parecida a </w:t>
+      </w:r>
+      <w:r>
+        <w:rPr>
+          <w:rFonts w:ascii="Consolas" w:hAnsi="Consolas" w:eastAsia="Consolas"/>
+          <w:b w:val="0"/>
+          <w:sz w:val="22"/>
+        </w:rPr>
+        <w:t>7 vulnerabilities (3 low, 1 moderate, 3 high)</w:t>
+      </w:r>
+      <w:r>
+        <w:rPr>
+          <w:rFonts w:ascii="Arial" w:hAnsi="Arial" w:eastAsia="Arial"/>
+          <w:b w:val="0"/>
+          <w:sz w:val="22"/>
+        </w:rPr>
+        <w:t>.</w:t>
+      </w:r>
+    </w:p>
+    <w:p>
+      <w:pPr>
+        <w:spacing w:line="360" w:lineRule="auto" w:before="0" w:after="120"/>
+        <w:jc w:val="both"/>
+      </w:pPr>
+      <w:r>
+        <w:rPr>
+          <w:rFonts w:ascii="Arial" w:hAnsi="Arial" w:eastAsia="Arial"/>
+          <w:b w:val="0"/>
+          <w:sz w:val="22"/>
+        </w:rPr>
+        <w:t xml:space="preserve">3. </w:t>
+      </w:r>
+      <w:r>
+        <w:rPr>
+          <w:rFonts w:ascii="Consolas" w:hAnsi="Consolas" w:eastAsia="Consolas"/>
+          <w:b w:val="0"/>
+          <w:sz w:val="22"/>
+        </w:rPr>
+        <w:t>CODIGO 1</w:t>
+      </w:r>
+      <w:r>
+        <w:rPr>
+          <w:rFonts w:ascii="Arial" w:hAnsi="Arial" w:eastAsia="Arial"/>
+          <w:b w:val="0"/>
+          <w:sz w:val="22"/>
+        </w:rPr>
+        <w:t>. Ese 1 significa que npm encontró vulnerabilidades. El informe es válido.</w:t>
+      </w:r>
+    </w:p>
+    <w:p>
+      <w:pPr>
+        <w:spacing w:line="360" w:lineRule="auto" w:before="0" w:after="120"/>
+        <w:jc w:val="both"/>
+      </w:pPr>
+      <w:r>
+        <w:rPr>
+          <w:rFonts w:ascii="Arial" w:hAnsi="Arial" w:eastAsia="Arial"/>
+          <w:b w:val="0"/>
+          <w:sz w:val="22"/>
+        </w:rPr>
+        <w:t xml:space="preserve">El arreglo que propone npm instala Express 4.22.3, fuera de la versión fijada en el proyecto. El archivo queda en </w:t>
       </w:r>
       <w:r>
         <w:rPr>
@@ -3163,7 +3690,23 @@
           <w:b w:val="0"/>
           <w:sz w:val="22"/>
         </w:rPr>
-        <w:t>La imagen tiene que existir (</w:t>
+        <w:t xml:space="preserve">Seguir en </w:t>
+      </w:r>
+      <w:r>
+        <w:rPr>
+          <w:rFonts w:ascii="Consolas" w:hAnsi="Consolas" w:eastAsia="Consolas"/>
+          <w:b w:val="0"/>
+          <w:sz w:val="22"/>
+        </w:rPr>
+        <w:t>codigo\atlas</w:t>
+      </w:r>
+      <w:r>
+        <w:rPr>
+          <w:rFonts w:ascii="Arial" w:hAnsi="Arial" w:eastAsia="Arial"/>
+          <w:b w:val="0"/>
+          <w:sz w:val="22"/>
+        </w:rPr>
+        <w:t xml:space="preserve">. Este comando no llama a la página: lee la imagen que creó </w:t>
       </w:r>
       <w:r>
         <w:rPr>
@@ -3179,7 +3722,7 @@
           <w:b w:val="0"/>
           <w:sz w:val="22"/>
         </w:rPr>
-        <w:t xml:space="preserve"> ya la crea):</w:t>
+        <w:t>. La primera vez descarga la base de vulnerabilidades y puede tardar más que los otros.</w:t>
       </w:r>
     </w:p>
     <w:p>
@@ -3193,7 +3736,9 @@
           <w:b w:val="0"/>
           <w:sz w:val="18"/>
         </w:rPr>
-        <w:t>docker run --rm -v /var/run/docker.sock:/var/run/docker.sock aquasec/trivy:latest image --severity CRITICAL,HIGH,MEDIUM --no-progress atlas-api:latest</w:t>
+        <w:t>docker run --rm -v /var/run/docker.sock:/var/run/docker.sock aquasec/trivy:latest image --severity CRITICAL,HIGH,MEDIUM --no-progress atlas-api:latest 2&gt;&amp;1 | Tee-Object -FilePath ..\..\evidencias\atlas\otras\trivy-api.txt</w:t>
+        <w:br/>
+        <w:t>Write-Output "CODIGO $LASTEXITCODE"</w:t>
       </w:r>
     </w:p>
     <w:p>
@@ -3207,35 +3752,7 @@
           <w:b w:val="0"/>
           <w:sz w:val="22"/>
         </w:rPr>
-        <w:t>En la corrida del 17-10-2026:</w:t>
-      </w:r>
-    </w:p>
-    <w:p>
-      <w:pPr>
-        <w:spacing w:line="360" w:lineRule="auto" w:before="0" w:after="40"/>
-        <w:jc w:val="left"/>
-      </w:pPr>
-      <w:r>
-        <w:rPr>
-          <w:rFonts w:ascii="Arial" w:hAnsi="Arial" w:eastAsia="Arial"/>
-          <w:b w:val="0"/>
-          <w:sz w:val="22"/>
-        </w:rPr>
-        <w:t>Alpine 3.24.2: 1 media (zlib). 0 críticas y 0 altas del sistema operativo.</w:t>
-      </w:r>
-    </w:p>
-    <w:p>
-      <w:pPr>
-        <w:spacing w:line="360" w:lineRule="auto" w:before="0" w:after="40"/>
-        <w:jc w:val="left"/>
-      </w:pPr>
-      <w:r>
-        <w:rPr>
-          <w:rFonts w:ascii="Arial" w:hAnsi="Arial" w:eastAsia="Arial"/>
-          <w:b w:val="0"/>
-          <w:sz w:val="22"/>
-        </w:rPr>
-        <w:t>Paquetes Node de la imagen: 25 altos, 11 medios y 0 críticos.</w:t>
+        <w:t>Qué esperar:</w:t>
       </w:r>
     </w:p>
     <w:p>
@@ -3249,7 +3766,129 @@
           <w:b w:val="0"/>
           <w:sz w:val="22"/>
         </w:rPr>
-        <w:t xml:space="preserve">El log está en </w:t>
+        <w:t xml:space="preserve">1. Líneas </w:t>
+      </w:r>
+      <w:r>
+        <w:rPr>
+          <w:rFonts w:ascii="Consolas" w:hAnsi="Consolas" w:eastAsia="Consolas"/>
+          <w:b w:val="0"/>
+          <w:sz w:val="22"/>
+        </w:rPr>
+        <w:t>Downloading vulnerability DB</w:t>
+      </w:r>
+      <w:r>
+        <w:rPr>
+          <w:rFonts w:ascii="Arial" w:hAnsi="Arial" w:eastAsia="Arial"/>
+          <w:b w:val="0"/>
+          <w:sz w:val="22"/>
+        </w:rPr>
+        <w:t xml:space="preserve"> y después </w:t>
+      </w:r>
+      <w:r>
+        <w:rPr>
+          <w:rFonts w:ascii="Consolas" w:hAnsi="Consolas" w:eastAsia="Consolas"/>
+          <w:b w:val="0"/>
+          <w:sz w:val="22"/>
+        </w:rPr>
+        <w:t>Detected OS</w:t>
+      </w:r>
+      <w:r>
+        <w:rPr>
+          <w:rFonts w:ascii="Arial" w:hAnsi="Arial" w:eastAsia="Arial"/>
+          <w:b w:val="0"/>
+          <w:sz w:val="22"/>
+        </w:rPr>
+        <w:t xml:space="preserve"> con Alpine.</w:t>
+      </w:r>
+    </w:p>
+    <w:p>
+      <w:pPr>
+        <w:spacing w:line="360" w:lineRule="auto" w:before="0" w:after="120"/>
+        <w:jc w:val="both"/>
+      </w:pPr>
+      <w:r>
+        <w:rPr>
+          <w:rFonts w:ascii="Arial" w:hAnsi="Arial" w:eastAsia="Arial"/>
+          <w:b w:val="0"/>
+          <w:sz w:val="22"/>
+        </w:rPr>
+        <w:t xml:space="preserve">2. Una tabla con </w:t>
+      </w:r>
+      <w:r>
+        <w:rPr>
+          <w:rFonts w:ascii="Consolas" w:hAnsi="Consolas" w:eastAsia="Consolas"/>
+          <w:b w:val="0"/>
+          <w:sz w:val="22"/>
+        </w:rPr>
+        <w:t>atlas-api:latest (alpine ...)</w:t>
+      </w:r>
+      <w:r>
+        <w:rPr>
+          <w:rFonts w:ascii="Arial" w:hAnsi="Arial" w:eastAsia="Arial"/>
+          <w:b w:val="0"/>
+          <w:sz w:val="22"/>
+        </w:rPr>
+        <w:t xml:space="preserve"> y otra con paquetes </w:t>
+      </w:r>
+      <w:r>
+        <w:rPr>
+          <w:rFonts w:ascii="Consolas" w:hAnsi="Consolas" w:eastAsia="Consolas"/>
+          <w:b w:val="0"/>
+          <w:sz w:val="22"/>
+        </w:rPr>
+        <w:t>node-pkg</w:t>
+      </w:r>
+      <w:r>
+        <w:rPr>
+          <w:rFonts w:ascii="Arial" w:hAnsi="Arial" w:eastAsia="Arial"/>
+          <w:b w:val="0"/>
+          <w:sz w:val="22"/>
+        </w:rPr>
+        <w:t>.</w:t>
+      </w:r>
+    </w:p>
+    <w:p>
+      <w:pPr>
+        <w:spacing w:line="360" w:lineRule="auto" w:before="0" w:after="120"/>
+        <w:jc w:val="both"/>
+      </w:pPr>
+      <w:r>
+        <w:rPr>
+          <w:rFonts w:ascii="Arial" w:hAnsi="Arial" w:eastAsia="Arial"/>
+          <w:b w:val="0"/>
+          <w:sz w:val="22"/>
+        </w:rPr>
+        <w:t xml:space="preserve">3. </w:t>
+      </w:r>
+      <w:r>
+        <w:rPr>
+          <w:rFonts w:ascii="Consolas" w:hAnsi="Consolas" w:eastAsia="Consolas"/>
+          <w:b w:val="0"/>
+          <w:sz w:val="22"/>
+        </w:rPr>
+        <w:t>CODIGO 0</w:t>
+      </w:r>
+      <w:r>
+        <w:rPr>
+          <w:rFonts w:ascii="Arial" w:hAnsi="Arial" w:eastAsia="Arial"/>
+          <w:b w:val="0"/>
+          <w:sz w:val="22"/>
+        </w:rPr>
+        <w:t>.</w:t>
+      </w:r>
+    </w:p>
+    <w:p>
+      <w:pPr>
+        <w:spacing w:line="360" w:lineRule="auto" w:before="0" w:after="120"/>
+        <w:jc w:val="both"/>
+      </w:pPr>
+      <w:r>
+        <w:rPr>
+          <w:rFonts w:ascii="Arial" w:hAnsi="Arial" w:eastAsia="Arial"/>
+          <w:b w:val="0"/>
+          <w:sz w:val="22"/>
+        </w:rPr>
+        <w:t xml:space="preserve">En la corrida del 17-10-2026, Alpine tenía 1 hallazgo medio y 0 críticos. Los paquetes Node de la imagen sumaban 25 altos, 11 medios y 0 críticos. Parte de esos altos está en herramientas de npm que vienen dentro de la imagen. El archivo queda en </w:t>
       </w:r>
       <w:r>
         <w:rPr>
@@ -3265,7 +3904,69 @@
           <w:b w:val="0"/>
           <w:sz w:val="22"/>
         </w:rPr>
-        <w:t>. También alimenta el INC-05. Parte de los altos está en herramientas de npm que vienen dentro de la imagen, no solo en el código de Atlas.</w:t>
+        <w:t xml:space="preserve"> y también alimenta el INC-05.</w:t>
+      </w:r>
+    </w:p>
+    <w:p>
+      <w:pPr>
+        <w:spacing w:line="360" w:lineRule="auto" w:before="0" w:after="120"/>
+        <w:jc w:val="both"/>
+      </w:pPr>
+      <w:r>
+        <w:rPr>
+          <w:rFonts w:ascii="Arial" w:hAnsi="Arial" w:eastAsia="Arial"/>
+          <w:b w:val="0"/>
+          <w:sz w:val="22"/>
+        </w:rPr>
+        <w:t xml:space="preserve">Si dice que no encuentra la imagen </w:t>
+      </w:r>
+      <w:r>
+        <w:rPr>
+          <w:rFonts w:ascii="Consolas" w:hAnsi="Consolas" w:eastAsia="Consolas"/>
+          <w:b w:val="0"/>
+          <w:sz w:val="22"/>
+        </w:rPr>
+        <w:t>atlas-api:latest</w:t>
+      </w:r>
+      <w:r>
+        <w:rPr>
+          <w:rFonts w:ascii="Arial" w:hAnsi="Arial" w:eastAsia="Arial"/>
+          <w:b w:val="0"/>
+          <w:sz w:val="22"/>
+        </w:rPr>
+        <w:t xml:space="preserve">, correr </w:t>
+      </w:r>
+      <w:r>
+        <w:rPr>
+          <w:rFonts w:ascii="Consolas" w:hAnsi="Consolas" w:eastAsia="Consolas"/>
+          <w:b w:val="0"/>
+          <w:sz w:val="22"/>
+        </w:rPr>
+        <w:t>docker images</w:t>
+      </w:r>
+      <w:r>
+        <w:rPr>
+          <w:rFonts w:ascii="Arial" w:hAnsi="Arial" w:eastAsia="Arial"/>
+          <w:b w:val="0"/>
+          <w:sz w:val="22"/>
+        </w:rPr>
+        <w:t xml:space="preserve"> y repetir el comando con el nombre que aparezca para el servicio </w:t>
+      </w:r>
+      <w:r>
+        <w:rPr>
+          <w:rFonts w:ascii="Consolas" w:hAnsi="Consolas" w:eastAsia="Consolas"/>
+          <w:b w:val="0"/>
+          <w:sz w:val="22"/>
+        </w:rPr>
+        <w:t>api</w:t>
+      </w:r>
+      <w:r>
+        <w:rPr>
+          <w:rFonts w:ascii="Arial" w:hAnsi="Arial" w:eastAsia="Arial"/>
+          <w:b w:val="0"/>
+          <w:sz w:val="22"/>
+        </w:rPr>
+        <w:t>.</w:t>
       </w:r>
     </w:p>
     <w:p>
@@ -3294,7 +3995,55 @@
           <w:b w:val="0"/>
           <w:sz w:val="22"/>
         </w:rPr>
-        <w:t>Desde la raíz del repositorio, con http://localhost:8080 abierto:</w:t>
+        <w:t xml:space="preserve">ZAP guarda el HTML en </w:t>
+      </w:r>
+      <w:r>
+        <w:rPr>
+          <w:rFonts w:ascii="Consolas" w:hAnsi="Consolas" w:eastAsia="Consolas"/>
+          <w:b w:val="0"/>
+          <w:sz w:val="22"/>
+        </w:rPr>
+        <w:t>evidencias\atlas\otras</w:t>
+      </w:r>
+      <w:r>
+        <w:rPr>
+          <w:rFonts w:ascii="Arial" w:hAnsi="Arial" w:eastAsia="Arial"/>
+          <w:b w:val="0"/>
+          <w:sz w:val="22"/>
+        </w:rPr>
+        <w:t xml:space="preserve">. Esa carpeta está en la raíz del repositorio, dos niveles más arriba de </w:t>
+      </w:r>
+      <w:r>
+        <w:rPr>
+          <w:rFonts w:ascii="Consolas" w:hAnsi="Consolas" w:eastAsia="Consolas"/>
+          <w:b w:val="0"/>
+          <w:sz w:val="22"/>
+        </w:rPr>
+        <w:t>codigo\atlas</w:t>
+      </w:r>
+      <w:r>
+        <w:rPr>
+          <w:rFonts w:ascii="Arial" w:hAnsi="Arial" w:eastAsia="Arial"/>
+          <w:b w:val="0"/>
+          <w:sz w:val="22"/>
+        </w:rPr>
+        <w:t xml:space="preserve">. Desde el prompt que termina en </w:t>
+      </w:r>
+      <w:r>
+        <w:rPr>
+          <w:rFonts w:ascii="Consolas" w:hAnsi="Consolas" w:eastAsia="Consolas"/>
+          <w:b w:val="0"/>
+          <w:sz w:val="22"/>
+        </w:rPr>
+        <w:t>\atlas</w:t>
+      </w:r>
+      <w:r>
+        <w:rPr>
+          <w:rFonts w:ascii="Arial" w:hAnsi="Arial" w:eastAsia="Arial"/>
+          <w:b w:val="0"/>
+          <w:sz w:val="22"/>
+        </w:rPr>
+        <w:t>:</w:t>
       </w:r>
     </w:p>
     <w:p>
@@ -3308,7 +4057,11 @@
           <w:b w:val="0"/>
           <w:sz w:val="18"/>
         </w:rPr>
-        <w:t>docker run --rm -v "${PWD}\evidencias\atlas\otras:/zap/wrk:rw" ghcr.io/zaproxy/zaproxy:stable zap-baseline.py -t http://host.docker.internal:8080 -I -r zap-pantalla.html</w:t>
+        <w:t>cd ..\..</w:t>
+        <w:br/>
+        <w:t>docker run --rm -v "${PWD}\evidencias\atlas\otras:/zap/wrk:rw" ghcr.io/zaproxy/zaproxy:stable zap-baseline.py -t http://host.docker.internal:8080 -I -r zap-pantalla.html 2&gt;&amp;1 | Tee-Object -FilePath .\evidencias\atlas\otras\zap-consola.txt</w:t>
+        <w:br/>
+        <w:t>Write-Output "CODIGO $LASTEXITCODE"</w:t>
       </w:r>
     </w:p>
     <w:p>
@@ -3318,11 +4071,19 @@
       </w:pPr>
       <w:r>
         <w:rPr>
+          <w:rFonts w:ascii="Consolas" w:hAnsi="Consolas" w:eastAsia="Consolas"/>
+          <w:b w:val="0"/>
+          <w:sz w:val="22"/>
+        </w:rPr>
+        <w:t>host.docker.internal</w:t>
+      </w:r>
+      <w:r>
+        <w:rPr>
           <w:rFonts w:ascii="Arial" w:hAnsi="Arial" w:eastAsia="Arial"/>
           <w:b w:val="0"/>
           <w:sz w:val="22"/>
         </w:rPr>
-        <w:t xml:space="preserve">La bandera </w:t>
+        <w:t xml:space="preserve"> es la forma en que el contenedor de ZAP llega a la pantalla que está en este equipo, en el puerto 8080. La bandera </w:t>
       </w:r>
       <w:r>
         <w:rPr>
@@ -3338,7 +4099,141 @@
           <w:b w:val="0"/>
           <w:sz w:val="22"/>
         </w:rPr>
-        <w:t xml:space="preserve"> evita que los avisos corten el comando. En la corrida del 17-10-2026: 0 fallos nuevos, 8 avisos y 59 controles en orden. Los avisos son de la pantalla publicada por nginx: faltan X-Frame-Options, X-Content-Type-Options y Content-Security-Policy, y el encabezado Server muestra la versión. La API envía cabeceras más estrictas. El HTML queda en </w:t>
+        <w:t xml:space="preserve"> hace que los avisos no corten el comando. La primera vez descarga la imagen y el análisis tarda alrededor de dos minutos.</w:t>
+      </w:r>
+    </w:p>
+    <w:p>
+      <w:pPr>
+        <w:spacing w:line="360" w:lineRule="auto" w:before="0" w:after="120"/>
+        <w:jc w:val="both"/>
+      </w:pPr>
+      <w:r>
+        <w:rPr>
+          <w:rFonts w:ascii="Arial" w:hAnsi="Arial" w:eastAsia="Arial"/>
+          <w:b w:val="0"/>
+          <w:sz w:val="22"/>
+        </w:rPr>
+        <w:t>Qué esperar:</w:t>
+      </w:r>
+    </w:p>
+    <w:p>
+      <w:pPr>
+        <w:spacing w:line="360" w:lineRule="auto" w:before="0" w:after="120"/>
+        <w:jc w:val="both"/>
+      </w:pPr>
+      <w:r>
+        <w:rPr>
+          <w:rFonts w:ascii="Arial" w:hAnsi="Arial" w:eastAsia="Arial"/>
+          <w:b w:val="0"/>
+          <w:sz w:val="22"/>
+        </w:rPr>
+        <w:t>1. Un avance del spider y del análisis pasivo.</w:t>
+      </w:r>
+    </w:p>
+    <w:p>
+      <w:pPr>
+        <w:spacing w:line="360" w:lineRule="auto" w:before="0" w:after="120"/>
+        <w:jc w:val="both"/>
+      </w:pPr>
+      <w:r>
+        <w:rPr>
+          <w:rFonts w:ascii="Arial" w:hAnsi="Arial" w:eastAsia="Arial"/>
+          <w:b w:val="0"/>
+          <w:sz w:val="22"/>
+        </w:rPr>
+        <w:t xml:space="preserve">2. Al final, </w:t>
+      </w:r>
+      <w:r>
+        <w:rPr>
+          <w:rFonts w:ascii="Consolas" w:hAnsi="Consolas" w:eastAsia="Consolas"/>
+          <w:b w:val="0"/>
+          <w:sz w:val="22"/>
+        </w:rPr>
+        <w:t>FAIL-NEW: 0</w:t>
+      </w:r>
+      <w:r>
+        <w:rPr>
+          <w:rFonts w:ascii="Arial" w:hAnsi="Arial" w:eastAsia="Arial"/>
+          <w:b w:val="0"/>
+          <w:sz w:val="22"/>
+        </w:rPr>
+        <w:t xml:space="preserve">, </w:t>
+      </w:r>
+      <w:r>
+        <w:rPr>
+          <w:rFonts w:ascii="Consolas" w:hAnsi="Consolas" w:eastAsia="Consolas"/>
+          <w:b w:val="0"/>
+          <w:sz w:val="22"/>
+        </w:rPr>
+        <w:t>WARN-NEW: 8</w:t>
+      </w:r>
+      <w:r>
+        <w:rPr>
+          <w:rFonts w:ascii="Arial" w:hAnsi="Arial" w:eastAsia="Arial"/>
+          <w:b w:val="0"/>
+          <w:sz w:val="22"/>
+        </w:rPr>
+        <w:t xml:space="preserve"> y </w:t>
+      </w:r>
+      <w:r>
+        <w:rPr>
+          <w:rFonts w:ascii="Consolas" w:hAnsi="Consolas" w:eastAsia="Consolas"/>
+          <w:b w:val="0"/>
+          <w:sz w:val="22"/>
+        </w:rPr>
+        <w:t>PASS: 59</w:t>
+      </w:r>
+      <w:r>
+        <w:rPr>
+          <w:rFonts w:ascii="Arial" w:hAnsi="Arial" w:eastAsia="Arial"/>
+          <w:b w:val="0"/>
+          <w:sz w:val="22"/>
+        </w:rPr>
+        <w:t>. Esos números pueden moverse un poco en otra corrida.</w:t>
+      </w:r>
+    </w:p>
+    <w:p>
+      <w:pPr>
+        <w:spacing w:line="360" w:lineRule="auto" w:before="0" w:after="120"/>
+        <w:jc w:val="both"/>
+      </w:pPr>
+      <w:r>
+        <w:rPr>
+          <w:rFonts w:ascii="Arial" w:hAnsi="Arial" w:eastAsia="Arial"/>
+          <w:b w:val="0"/>
+          <w:sz w:val="22"/>
+        </w:rPr>
+        <w:t xml:space="preserve">3. </w:t>
+      </w:r>
+      <w:r>
+        <w:rPr>
+          <w:rFonts w:ascii="Consolas" w:hAnsi="Consolas" w:eastAsia="Consolas"/>
+          <w:b w:val="0"/>
+          <w:sz w:val="22"/>
+        </w:rPr>
+        <w:t>CODIGO 0</w:t>
+      </w:r>
+      <w:r>
+        <w:rPr>
+          <w:rFonts w:ascii="Arial" w:hAnsi="Arial" w:eastAsia="Arial"/>
+          <w:b w:val="0"/>
+          <w:sz w:val="22"/>
+        </w:rPr>
+        <w:t>.</w:t>
+      </w:r>
+    </w:p>
+    <w:p>
+      <w:pPr>
+        <w:spacing w:line="360" w:lineRule="auto" w:before="0" w:after="120"/>
+        <w:jc w:val="both"/>
+      </w:pPr>
+      <w:r>
+        <w:rPr>
+          <w:rFonts w:ascii="Arial" w:hAnsi="Arial" w:eastAsia="Arial"/>
+          <w:b w:val="0"/>
+          <w:sz w:val="22"/>
+        </w:rPr>
+        <w:t xml:space="preserve">4. El archivo </w:t>
       </w:r>
       <w:r>
         <w:rPr>
@@ -3354,7 +4249,37 @@
           <w:b w:val="0"/>
           <w:sz w:val="22"/>
         </w:rPr>
-        <w:t>. Es el INC-06, moderado y abierto.</w:t>
+        <w:t>. Se abre con el navegador.</w:t>
+      </w:r>
+    </w:p>
+    <w:p>
+      <w:pPr>
+        <w:spacing w:line="360" w:lineRule="auto" w:before="0" w:after="120"/>
+        <w:jc w:val="both"/>
+      </w:pPr>
+      <w:r>
+        <w:rPr>
+          <w:rFonts w:ascii="Arial" w:hAnsi="Arial" w:eastAsia="Arial"/>
+          <w:b w:val="0"/>
+          <w:sz w:val="22"/>
+        </w:rPr>
+        <w:t xml:space="preserve">En la corrida del 17-10-2026 los avisos eran de la pantalla publicada por nginx: faltan X-Frame-Options, X-Content-Type-Options y Content-Security-Policy, y el encabezado Server muestra la versión. Es el INC-06, moderado y abierto. Para seguir con otro comando dentro de Atlas, volver con </w:t>
+      </w:r>
+      <w:r>
+        <w:rPr>
+          <w:rFonts w:ascii="Consolas" w:hAnsi="Consolas" w:eastAsia="Consolas"/>
+          <w:b w:val="0"/>
+          <w:sz w:val="22"/>
+        </w:rPr>
+        <w:t>cd codigo\atlas</w:t>
+      </w:r>
+      <w:r>
+        <w:rPr>
+          <w:rFonts w:ascii="Arial" w:hAnsi="Arial" w:eastAsia="Arial"/>
+          <w:b w:val="0"/>
+          <w:sz w:val="22"/>
+        </w:rPr>
+        <w:t>.</w:t>
       </w:r>
     </w:p>
     <w:p>
@@ -3383,9 +4308,343 @@
           <w:b w:val="0"/>
           <w:sz w:val="22"/>
         </w:rPr>
-        <w:t>Siguen fuera de estas pruebas: HTTPS fuera de localhost (INC-03), el correo de verificación (INC-04), la disponibilidad de 99,5 % y la prueba con adultos mayores. SonarQube, ESLint y JMeter no están instalados en este equipo. La carga se midió con k6, que entrega usuarios concurrentes y percentil 95.</w:t>
+        <w:t>Siguen fuera de estas pruebas: HTTPS fuera de localhost (INC-03), el correo de verificación (INC-04), la disponibilidad de 99,5 % y la prueba con adultos mayores. SonarQube, ESLint y JMeter no están instalados en este equipo. La carga se mide con el paso 11.</w:t>
       </w:r>
     </w:p>
+    <w:p>
+      <w:pPr>
+        <w:spacing w:line="360" w:lineRule="auto" w:before="240" w:after="80"/>
+        <w:jc w:val="left"/>
+      </w:pPr>
+      <w:r>
+        <w:rPr>
+          <w:rFonts w:ascii="Arial" w:hAnsi="Arial" w:eastAsia="Arial"/>
+          <w:b/>
+          <w:color w:val="182B46"/>
+          <w:sz w:val="24"/>
+        </w:rPr>
+        <w:t>16. Códigos que parecen error y no lo son</w:t>
+      </w:r>
+    </w:p>
+    <w:tbl>
+      <w:tblPr>
+        <w:tblStyle w:val="TableGrid"/>
+        <w:tblW w:type="auto" w:w="0"/>
+        <w:tblLook w:firstColumn="1" w:firstRow="1" w:lastColumn="0" w:lastRow="0" w:noHBand="0" w:noVBand="1" w:val="04A0"/>
+      </w:tblPr>
+      <w:tblGrid>
+        <w:gridCol w:w="3249"/>
+        <w:gridCol w:w="3249"/>
+        <w:gridCol w:w="3249"/>
+      </w:tblGrid>
+      <w:tr>
+        <w:tc>
+          <w:tcPr>
+            <w:tcW w:type="dxa" w:w="3249"/>
+            <w:shd w:fill="182B46" w:val="clear"/>
+          </w:tcPr>
+          <w:p>
+            <w:r/>
+            <w:r>
+              <w:rPr>
+                <w:rFonts w:ascii="Arial" w:hAnsi="Arial" w:eastAsia="Arial"/>
+                <w:b/>
+                <w:color w:val="FFFFFF"/>
+                <w:sz w:val="18"/>
+              </w:rPr>
+              <w:t>Código que aparece</w:t>
+            </w:r>
+          </w:p>
+        </w:tc>
+        <w:tc>
+          <w:tcPr>
+            <w:tcW w:type="dxa" w:w="3249"/>
+            <w:shd w:fill="182B46" w:val="clear"/>
+          </w:tcPr>
+          <w:p>
+            <w:r/>
+            <w:r>
+              <w:rPr>
+                <w:rFonts w:ascii="Arial" w:hAnsi="Arial" w:eastAsia="Arial"/>
+                <w:b/>
+                <w:color w:val="FFFFFF"/>
+                <w:sz w:val="18"/>
+              </w:rPr>
+              <w:t>Paso</w:t>
+            </w:r>
+          </w:p>
+        </w:tc>
+        <w:tc>
+          <w:tcPr>
+            <w:tcW w:type="dxa" w:w="3249"/>
+            <w:shd w:fill="182B46" w:val="clear"/>
+          </w:tcPr>
+          <w:p>
+            <w:r/>
+            <w:r>
+              <w:rPr>
+                <w:rFonts w:ascii="Arial" w:hAnsi="Arial" w:eastAsia="Arial"/>
+                <w:b/>
+                <w:color w:val="FFFFFF"/>
+                <w:sz w:val="18"/>
+              </w:rPr>
+              <w:t>Qué significa</w:t>
+            </w:r>
+          </w:p>
+        </w:tc>
+      </w:tr>
+      <w:tr>
+        <w:tc>
+          <w:tcPr>
+            <w:tcW w:type="dxa" w:w="3249"/>
+          </w:tcPr>
+          <w:p>
+            <w:r/>
+            <w:r>
+              <w:rPr>
+                <w:rFonts w:ascii="Consolas" w:hAnsi="Consolas" w:eastAsia="Consolas"/>
+                <w:b w:val="0"/>
+                <w:sz w:val="18"/>
+              </w:rPr>
+              <w:t>CODIGO 99</w:t>
+            </w:r>
+          </w:p>
+        </w:tc>
+        <w:tc>
+          <w:tcPr>
+            <w:tcW w:type="dxa" w:w="3249"/>
+          </w:tcPr>
+          <w:p>
+            <w:r/>
+            <w:r>
+              <w:rPr>
+                <w:rFonts w:ascii="Arial" w:hAnsi="Arial" w:eastAsia="Arial"/>
+                <w:b w:val="0"/>
+                <w:sz w:val="18"/>
+              </w:rPr>
+              <w:t>11, k6</w:t>
+            </w:r>
+          </w:p>
+        </w:tc>
+        <w:tc>
+          <w:tcPr>
+            <w:tcW w:type="dxa" w:w="3249"/>
+          </w:tcPr>
+          <w:p>
+            <w:r/>
+            <w:r>
+              <w:rPr>
+                <w:rFonts w:ascii="Arial" w:hAnsi="Arial" w:eastAsia="Arial"/>
+                <w:b w:val="0"/>
+                <w:sz w:val="18"/>
+              </w:rPr>
+              <w:t>La prueba terminó. El p95 pasó de 300 ms</w:t>
+            </w:r>
+          </w:p>
+        </w:tc>
+      </w:tr>
+      <w:tr>
+        <w:tc>
+          <w:tcPr>
+            <w:tcW w:type="dxa" w:w="3249"/>
+          </w:tcPr>
+          <w:p>
+            <w:r/>
+            <w:r>
+              <w:rPr>
+                <w:rFonts w:ascii="Consolas" w:hAnsi="Consolas" w:eastAsia="Consolas"/>
+                <w:b w:val="0"/>
+                <w:sz w:val="18"/>
+              </w:rPr>
+              <w:t>CODIGO 1</w:t>
+            </w:r>
+          </w:p>
+        </w:tc>
+        <w:tc>
+          <w:tcPr>
+            <w:tcW w:type="dxa" w:w="3249"/>
+          </w:tcPr>
+          <w:p>
+            <w:r/>
+            <w:r>
+              <w:rPr>
+                <w:rFonts w:ascii="Arial" w:hAnsi="Arial" w:eastAsia="Arial"/>
+                <w:b w:val="0"/>
+                <w:sz w:val="18"/>
+              </w:rPr>
+              <w:t>12, npm audit</w:t>
+            </w:r>
+          </w:p>
+        </w:tc>
+        <w:tc>
+          <w:tcPr>
+            <w:tcW w:type="dxa" w:w="3249"/>
+          </w:tcPr>
+          <w:p>
+            <w:r/>
+            <w:r>
+              <w:rPr>
+                <w:rFonts w:ascii="Arial" w:hAnsi="Arial" w:eastAsia="Arial"/>
+                <w:b w:val="0"/>
+                <w:sz w:val="18"/>
+              </w:rPr>
+              <w:t>El informe se generó y hay vulnerabilidades</w:t>
+            </w:r>
+          </w:p>
+        </w:tc>
+      </w:tr>
+      <w:tr>
+        <w:tc>
+          <w:tcPr>
+            <w:tcW w:type="dxa" w:w="3249"/>
+          </w:tcPr>
+          <w:p>
+            <w:r/>
+            <w:r>
+              <w:rPr>
+                <w:rFonts w:ascii="Consolas" w:hAnsi="Consolas" w:eastAsia="Consolas"/>
+                <w:b w:val="0"/>
+                <w:sz w:val="18"/>
+              </w:rPr>
+              <w:t>CODIGO 0</w:t>
+            </w:r>
+          </w:p>
+        </w:tc>
+        <w:tc>
+          <w:tcPr>
+            <w:tcW w:type="dxa" w:w="3249"/>
+          </w:tcPr>
+          <w:p>
+            <w:r/>
+            <w:r>
+              <w:rPr>
+                <w:rFonts w:ascii="Arial" w:hAnsi="Arial" w:eastAsia="Arial"/>
+                <w:b w:val="0"/>
+                <w:sz w:val="18"/>
+              </w:rPr>
+              <w:t>13 y 14</w:t>
+            </w:r>
+          </w:p>
+        </w:tc>
+        <w:tc>
+          <w:tcPr>
+            <w:tcW w:type="dxa" w:w="3249"/>
+          </w:tcPr>
+          <w:p>
+            <w:r/>
+            <w:r>
+              <w:rPr>
+                <w:rFonts w:ascii="Arial" w:hAnsi="Arial" w:eastAsia="Arial"/>
+                <w:b w:val="0"/>
+                <w:sz w:val="18"/>
+              </w:rPr>
+              <w:t>Trivy y ZAP terminaron</w:t>
+            </w:r>
+          </w:p>
+        </w:tc>
+      </w:tr>
+      <w:tr>
+        <w:tc>
+          <w:tcPr>
+            <w:tcW w:type="dxa" w:w="3249"/>
+          </w:tcPr>
+          <w:p>
+            <w:r/>
+            <w:r>
+              <w:rPr>
+                <w:rFonts w:ascii="Consolas" w:hAnsi="Consolas" w:eastAsia="Consolas"/>
+                <w:b w:val="0"/>
+                <w:sz w:val="18"/>
+              </w:rPr>
+              <w:t>Unable to find image</w:t>
+            </w:r>
+          </w:p>
+        </w:tc>
+        <w:tc>
+          <w:tcPr>
+            <w:tcW w:type="dxa" w:w="3249"/>
+          </w:tcPr>
+          <w:p>
+            <w:r/>
+            <w:r>
+              <w:rPr>
+                <w:rFonts w:ascii="Arial" w:hAnsi="Arial" w:eastAsia="Arial"/>
+                <w:b w:val="0"/>
+                <w:sz w:val="18"/>
+              </w:rPr>
+              <w:t>11, 13 o 14</w:t>
+            </w:r>
+          </w:p>
+        </w:tc>
+        <w:tc>
+          <w:tcPr>
+            <w:tcW w:type="dxa" w:w="3249"/>
+          </w:tcPr>
+          <w:p>
+            <w:r/>
+            <w:r>
+              <w:rPr>
+                <w:rFonts w:ascii="Arial" w:hAnsi="Arial" w:eastAsia="Arial"/>
+                <w:b w:val="0"/>
+                <w:sz w:val="18"/>
+              </w:rPr>
+              <w:t>Docker está descargando la herramienta</w:t>
+            </w:r>
+          </w:p>
+        </w:tc>
+      </w:tr>
+      <w:tr>
+        <w:tc>
+          <w:tcPr>
+            <w:tcW w:type="dxa" w:w="3249"/>
+          </w:tcPr>
+          <w:p>
+            <w:r/>
+            <w:r>
+              <w:rPr>
+                <w:rFonts w:ascii="Arial" w:hAnsi="Arial" w:eastAsia="Arial"/>
+                <w:b w:val="0"/>
+                <w:sz w:val="18"/>
+              </w:rPr>
+              <w:t>Texto rojo en PowerShell</w:t>
+            </w:r>
+          </w:p>
+        </w:tc>
+        <w:tc>
+          <w:tcPr>
+            <w:tcW w:type="dxa" w:w="3249"/>
+          </w:tcPr>
+          <w:p>
+            <w:r/>
+            <w:r>
+              <w:rPr>
+                <w:rFonts w:ascii="Arial" w:hAnsi="Arial" w:eastAsia="Arial"/>
+                <w:b w:val="0"/>
+                <w:sz w:val="18"/>
+              </w:rPr>
+              <w:t>cualquiera</w:t>
+            </w:r>
+          </w:p>
+        </w:tc>
+        <w:tc>
+          <w:tcPr>
+            <w:tcW w:type="dxa" w:w="3249"/>
+          </w:tcPr>
+          <w:p>
+            <w:r/>
+            <w:r>
+              <w:rPr>
+                <w:rFonts w:ascii="Arial" w:hAnsi="Arial" w:eastAsia="Arial"/>
+                <w:b w:val="0"/>
+                <w:sz w:val="18"/>
+              </w:rPr>
+              <w:t>Aviso de Docker. Leer el final de la salida</w:t>
+            </w:r>
+          </w:p>
+        </w:tc>
+      </w:tr>
+    </w:tbl>
+    <w:p/>
     <w:sectPr>
       <w:footerReference w:type="default" r:id="rId9"/>
       <w:pgSz w:w="12240" w:h="15840"/>

</xml_diff>